<commit_message>
Expand Viamericas post past 600 words with a timely fintech-sports section
Add "Fintech's sports land grab is getting smarter": Revolut's Audi F1
show car on Como 1907's pitch as the vivid portfolio-synergy example,
contrasted with precision players (Ria/Mexico NT, Intermex/LA Galaxy,
~70% Latino MLS viewership) that Viamericas sits among, with the 2026
World Cup as accelerant. Grows the post from ~440 to ~700 words; refreshes
date to 2026-09-08; adds Revolut/Ria/Intermex sources. No em dashes.
Markdown + Word.

Co-Authored-By: Claude Opus 4.8 <noreply@anthropic.com>
Claude-Session: https://claude.ai/code/session_01WdmaS8fb3WHmxD5MVo6UfL
</commit_message>
<xml_diff>
--- a/blog/NYCFC-Viamericas-Remittance-Partner.docx
+++ b/blog/NYCFC-Viamericas-Remittance-Partner.docx
@@ -4,15 +4,15 @@
   <w:body>
     <w:p>
       <w:pPr>
-        <w:spacing w:after="100"/>
+        <w:spacing w:after="140"/>
       </w:pPr>
       <w:r>
         <w:rPr>
           <w:b/>
           <w:bCs/>
           <w:color w:val="1A1A2E"/>
-          <w:sz w:val="34"/>
-          <w:szCs w:val="34"/>
+          <w:sz w:val="36"/>
+          <w:szCs w:val="36"/>
         </w:rPr>
         <w:t xml:space="preserve">New York City FC Names Viamericas Its Official Money Transfer and Remittance Partner</w:t>
       </w:r>
@@ -25,7 +25,6 @@
         <w:rPr>
           <w:i/>
           <w:iCs/>
-          <w:color w:val="555555"/>
           <w:sz w:val="22"/>
           <w:szCs w:val="22"/>
         </w:rPr>
@@ -40,11 +39,10 @@
         <w:rPr>
           <w:i/>
           <w:iCs/>
-          <w:color w:val="777777"/>
-          <w:sz w:val="20"/>
-          <w:szCs w:val="20"/>
-        </w:rPr>
-        <w:t xml:space="preserve">Draft for the TransPerfect Financial Services blog  ·  2026-08-11</w:t>
+          <w:sz w:val="22"/>
+          <w:szCs w:val="22"/>
+        </w:rPr>
+        <w:t xml:space="preserve">Draft for the TransPerfect Financial Services blog · 2026-09-08</w:t>
       </w:r>
     </w:p>
     <w:p>
@@ -52,7 +50,7 @@
         <w:pBdr>
           <w:bottom w:val="single" w:color="CCCCCC" w:sz="6" w:space="1"/>
         </w:pBdr>
-        <w:spacing w:after="160" w:before="160"/>
+        <w:spacing w:after="120" w:before="120"/>
       </w:pPr>
       <w:r>
         <w:t xml:space="preserve"/>
@@ -85,7 +83,7 @@
         </w:rPr>
         <w:t xml:space="preserve"> its Official International Money Transfer and Remittance Partner, the club </w:t>
       </w:r>
-      <w:hyperlink w:history="1" r:id="rIdxmgdbqdts260gzjtfu1li">
+      <w:hyperlink w:history="1" r:id="rIdmvzgjto8wrswlejygwwar">
         <w:r>
           <w:rPr>
             <w:rStyle w:val="Hyperlink"/>
@@ -102,22 +100,22 @@
         </w:rPr>
         <w:t xml:space="preserve">. The deal gives Viamericas a prominent, first-of-its-kind spot: its brand becomes the </w:t>
       </w:r>
-      <w:hyperlink w:history="1" r:id="rIdr8jlqxksto_5zfl8dssnx">
-        <w:r>
-          <w:rPr>
-            <w:rStyle w:val="Hyperlink"/>
-            <w:sz w:val="22"/>
-            <w:szCs w:val="22"/>
-          </w:rPr>
-          <w:t xml:space="preserve">first-ever sponsor on the back of NYCFC’s First Team training kit</w:t>
-        </w:r>
-      </w:hyperlink>
-      <w:r>
-        <w:rPr>
-          <w:sz w:val="22"/>
-          <w:szCs w:val="22"/>
-        </w:rPr>
-        <w:t xml:space="preserve">, reinforced by in-stadium branding on matchdays. Both sides framed the tie-up around a shared connection to diverse, global communities, a natural fit for a remittance brand and a club whose fan base mirrors one of the world’s most international cities.</w:t>
+      <w:hyperlink w:history="1" r:id="rIdmlzskysagxzpalcrl0anp">
+        <w:r>
+          <w:rPr>
+            <w:rStyle w:val="Hyperlink"/>
+            <w:sz w:val="22"/>
+            <w:szCs w:val="22"/>
+          </w:rPr>
+          <w:t xml:space="preserve">first-ever sponsor on the back of NYCFC's First Team training kit</w:t>
+        </w:r>
+      </w:hyperlink>
+      <w:r>
+        <w:rPr>
+          <w:sz w:val="22"/>
+          <w:szCs w:val="22"/>
+        </w:rPr>
+        <w:t xml:space="preserve">, reinforced by in-stadium branding on matchdays. Both sides framed the tie-up around a shared connection to diverse, global communities, a natural fit for a remittance brand and a club whose fan base mirrors one of the world's most international cities.</w:t>
       </w:r>
     </w:p>
     <w:p>
@@ -131,16 +129,16 @@
           <w:sz w:val="22"/>
           <w:szCs w:val="22"/>
         </w:rPr>
-        <w:t xml:space="preserve">About Viamericas. </w:t>
-      </w:r>
-      <w:r>
-        <w:rPr>
-          <w:sz w:val="22"/>
-          <w:szCs w:val="22"/>
-        </w:rPr>
-        <w:t xml:space="preserve">Viamericas is one of the largest licensed U.S. money transfer companies, serving families across </w:t>
-      </w:r>
-      <w:hyperlink w:history="1" r:id="rIdqwswqfmd4xsl6mm3aqod8">
+        <w:t xml:space="preserve">About Viamericas.</w:t>
+      </w:r>
+      <w:r>
+        <w:rPr>
+          <w:sz w:val="22"/>
+          <w:szCs w:val="22"/>
+        </w:rPr>
+        <w:t xml:space="preserve"> Viamericas is one of the largest licensed U.S. money transfer companies, serving families across </w:t>
+      </w:r>
+      <w:hyperlink w:history="1" r:id="rIdmccea-fe6sk_wbv8kysi_">
         <w:r>
           <w:rPr>
             <w:rStyle w:val="Hyperlink"/>
@@ -169,16 +167,16 @@
           <w:sz w:val="22"/>
           <w:szCs w:val="22"/>
         </w:rPr>
-        <w:t xml:space="preserve">The expansion play. </w:t>
-      </w:r>
-      <w:r>
-        <w:rPr>
-          <w:sz w:val="22"/>
-          <w:szCs w:val="22"/>
-        </w:rPr>
-        <w:t xml:space="preserve">The NYCFC sponsorship lands amid an aggressive growth push. In September 2025, Viamericas </w:t>
-      </w:r>
-      <w:hyperlink w:history="1" r:id="rIddi2voacthf_ojwmwra0bf">
+        <w:t xml:space="preserve">The expansion play.</w:t>
+      </w:r>
+      <w:r>
+        <w:rPr>
+          <w:sz w:val="22"/>
+          <w:szCs w:val="22"/>
+        </w:rPr>
+        <w:t xml:space="preserve"> The NYCFC sponsorship lands amid an aggressive growth push. In September 2025, Viamericas </w:t>
+      </w:r>
+      <w:hyperlink w:history="1" r:id="rIdn7dbw-xbroxdlvhdp6u4c">
         <w:r>
           <w:rPr>
             <w:rStyle w:val="Hyperlink"/>
@@ -198,18 +196,17 @@
     </w:p>
     <w:p>
       <w:pPr>
-        <w:pStyle w:val="Heading2"/>
-        <w:spacing w:after="120" w:before="260"/>
+        <w:spacing w:after="120" w:before="280"/>
       </w:pPr>
       <w:r>
         <w:rPr>
           <w:b/>
           <w:bCs/>
           <w:color w:val="4B3FBF"/>
-          <w:sz w:val="26"/>
-          <w:szCs w:val="26"/>
-        </w:rPr>
-        <w:t xml:space="preserve">The bigger picture: remittance is just the entry point</w:t>
+          <w:sz w:val="28"/>
+          <w:szCs w:val="28"/>
+        </w:rPr>
+        <w:t xml:space="preserve">Fintech's sports land grab is getting smarter</w:t>
       </w:r>
     </w:p>
     <w:p>
@@ -221,57 +218,138 @@
           <w:sz w:val="22"/>
           <w:szCs w:val="22"/>
         </w:rPr>
-        <w:t xml:space="preserve">The communities Viamericas serves aren’t only sending money home, they’re the fastest-rising economic force in the U.S. market. Per our partners at </w:t>
-      </w:r>
+        <w:t xml:space="preserve">Viamericas is not moving in isolation. Fintech has spent the past few years turning sport into a core acquisition channel, and in 2026 the strategy is maturing from scattered logo placements into something far more deliberate.</w:t>
+      </w:r>
+    </w:p>
+    <w:p>
+      <w:pPr>
+        <w:spacing w:after="160" w:line="288"/>
+      </w:pPr>
+      <w:r>
+        <w:rPr>
+          <w:sz w:val="22"/>
+          <w:szCs w:val="22"/>
+        </w:rPr>
+        <w:t xml:space="preserve">The most eye-catching example came this fall from Revolut. Having become the </w:t>
+      </w:r>
+      <w:hyperlink w:history="1" r:id="rId9f3s4geb-xemjmvuhkkcu">
+        <w:r>
+          <w:rPr>
+            <w:rStyle w:val="Hyperlink"/>
+            <w:sz w:val="22"/>
+            <w:szCs w:val="22"/>
+          </w:rPr>
+          <w:t xml:space="preserve">title partner of the new Audi F1 team</w:t>
+        </w:r>
+      </w:hyperlink>
+      <w:r>
+        <w:rPr>
+          <w:sz w:val="22"/>
+          <w:szCs w:val="22"/>
+        </w:rPr>
+        <w:t xml:space="preserve"> and, over the summer, a sponsor of Serie A's Como 1907, Revolut parked the Audi Revolut F1 show car </w:t>
+      </w:r>
+      <w:hyperlink w:history="1" r:id="rIdobnsjk2zc2_xokonp6jos">
+        <w:r>
+          <w:rPr>
+            <w:rStyle w:val="Hyperlink"/>
+            <w:sz w:val="22"/>
+            <w:szCs w:val="22"/>
+          </w:rPr>
+          <w:t xml:space="preserve">on Como's pitch</w:t>
+        </w:r>
+      </w:hyperlink>
+      <w:r>
+        <w:rPr>
+          <w:sz w:val="22"/>
+          <w:szCs w:val="22"/>
+        </w:rPr>
+        <w:t xml:space="preserve">, fusing Formula 1 and Italian football into a single activation people actually stop to photograph. It is a small stunt with a big idea behind it: a fintech getting more out of its sports portfolio, which also spans Manchester City and rugby's Stade Toulousain, by making the partnerships work together rather than stand alone.</w:t>
+      </w:r>
+    </w:p>
+    <w:p>
+      <w:pPr>
+        <w:spacing w:after="160" w:line="288"/>
+      </w:pPr>
+      <w:r>
+        <w:rPr>
+          <w:sz w:val="22"/>
+          <w:szCs w:val="22"/>
+        </w:rPr>
+        <w:t xml:space="preserve">Underneath the spectacle runs a quieter, more targeted current, and it is the one Viamericas is riding: money-movement brands going precisely where their customers already are. In 2026, </w:t>
+      </w:r>
+      <w:hyperlink w:history="1" r:id="rId6l0ecrtwtoveasrfiwfa2">
+        <w:r>
+          <w:rPr>
+            <w:rStyle w:val="Hyperlink"/>
+            <w:sz w:val="22"/>
+            <w:szCs w:val="22"/>
+          </w:rPr>
+          <w:t xml:space="preserve">Ria became the official remittance partner of Mexico's national teams</w:t>
+        </w:r>
+      </w:hyperlink>
+      <w:r>
+        <w:rPr>
+          <w:sz w:val="22"/>
+          <w:szCs w:val="22"/>
+        </w:rPr>
+        <w:t xml:space="preserve">, and </w:t>
+      </w:r>
+      <w:hyperlink w:history="1" r:id="rIdzp556-xsq2yairhecml0i">
+        <w:r>
+          <w:rPr>
+            <w:rStyle w:val="Hyperlink"/>
+            <w:sz w:val="22"/>
+            <w:szCs w:val="22"/>
+          </w:rPr>
+          <w:t xml:space="preserve">Intermex became the LA Galaxy's official international remittance partner</w:t>
+        </w:r>
+      </w:hyperlink>
+      <w:r>
+        <w:rPr>
+          <w:sz w:val="22"/>
+          <w:szCs w:val="22"/>
+        </w:rPr>
+        <w:t xml:space="preserve">, noting that nearly 70% of California's MLS viewership is Latino. The 2026 FIFA World Cup on North American soil, with its vast multicultural audience, is the accelerant behind much of it.</w:t>
+      </w:r>
+    </w:p>
+    <w:p>
+      <w:pPr>
+        <w:spacing w:after="160" w:line="288"/>
+      </w:pPr>
+      <w:r>
+        <w:rPr>
+          <w:sz w:val="22"/>
+          <w:szCs w:val="22"/>
+        </w:rPr>
+        <w:t xml:space="preserve">The lesson cuts both ways. Portfolio players like Revolut win by connecting partnerships; precision players like Viamericas win by matching one well-chosen partnership to the exact community they serve. Both are the same underlying move: treating sport as the front door to a customer relationship, not a billboard.</w:t>
+      </w:r>
+    </w:p>
+    <w:p>
+      <w:pPr>
+        <w:spacing w:after="120" w:before="280"/>
+      </w:pPr>
       <w:r>
         <w:rPr>
           <w:b/>
           <w:bCs/>
-          <w:sz w:val="22"/>
-          <w:szCs w:val="22"/>
-        </w:rPr>
-        <w:t xml:space="preserve">NAHREP</w:t>
-      </w:r>
-      <w:r>
-        <w:rPr>
-          <w:sz w:val="22"/>
-          <w:szCs w:val="22"/>
-        </w:rPr>
-        <w:t xml:space="preserve">, Hispanics reached a </w:t>
-      </w:r>
-      <w:hyperlink w:history="1" r:id="rIdmt2lgckvjoeetlwwfsoas">
-        <w:r>
-          <w:rPr>
-            <w:rStyle w:val="Hyperlink"/>
-            <w:sz w:val="22"/>
-            <w:szCs w:val="22"/>
-          </w:rPr>
-          <w:t xml:space="preserve">record 10.2 million homeowners in 2025</w:t>
-        </w:r>
-      </w:hyperlink>
-      <w:r>
-        <w:rPr>
-          <w:sz w:val="22"/>
-          <w:szCs w:val="22"/>
-        </w:rPr>
-        <w:t xml:space="preserve">, a net gain of 441,000 in a year when most other groups declined (</w:t>
-      </w:r>
-      <w:hyperlink w:history="1" r:id="rId5jcrtwoj73bfmx0dcxolx">
-        <w:r>
-          <w:rPr>
-            <w:rStyle w:val="Hyperlink"/>
-            <w:sz w:val="22"/>
-            <w:szCs w:val="22"/>
-          </w:rPr>
-          <w:t xml:space="preserve">State of Hispanic Homeownership Report</w:t>
-        </w:r>
-      </w:hyperlink>
-      <w:r>
-        <w:rPr>
-          <w:sz w:val="22"/>
-          <w:szCs w:val="22"/>
-        </w:rPr>
-        <w:t xml:space="preserve">). The </w:t>
+          <w:color w:val="4B3FBF"/>
+          <w:sz w:val="28"/>
+          <w:szCs w:val="28"/>
+        </w:rPr>
+        <w:t xml:space="preserve">The bigger picture: remittance is just the entry point</w:t>
+      </w:r>
+    </w:p>
+    <w:p>
+      <w:pPr>
+        <w:spacing w:after="160" w:line="288"/>
+      </w:pPr>
+      <w:r>
+        <w:rPr>
+          <w:sz w:val="22"/>
+          <w:szCs w:val="22"/>
+        </w:rPr>
+        <w:t xml:space="preserve">The communities Viamericas serves aren't only sending money home, they're the fastest-rising economic force in the U.S. market. Per our partners at </w:t>
       </w:r>
       <w:r>
         <w:rPr>
@@ -280,14 +358,48 @@
           <w:sz w:val="22"/>
           <w:szCs w:val="22"/>
         </w:rPr>
-        <w:t xml:space="preserve">AAPI</w:t>
-      </w:r>
-      <w:r>
-        <w:rPr>
-          <w:sz w:val="22"/>
-          <w:szCs w:val="22"/>
-        </w:rPr>
-        <w:t xml:space="preserve"> community is on a parallel climb, with </w:t>
+        <w:t xml:space="preserve">NAHREP</w:t>
+      </w:r>
+      <w:r>
+        <w:rPr>
+          <w:sz w:val="22"/>
+          <w:szCs w:val="22"/>
+        </w:rPr>
+        <w:t xml:space="preserve">, Hispanics reached a </w:t>
+      </w:r>
+      <w:hyperlink w:history="1" r:id="rIdeompaethyutkf_rclcuwo">
+        <w:r>
+          <w:rPr>
+            <w:rStyle w:val="Hyperlink"/>
+            <w:sz w:val="22"/>
+            <w:szCs w:val="22"/>
+          </w:rPr>
+          <w:t xml:space="preserve">record 10.2 million homeowners in 2025</w:t>
+        </w:r>
+      </w:hyperlink>
+      <w:r>
+        <w:rPr>
+          <w:sz w:val="22"/>
+          <w:szCs w:val="22"/>
+        </w:rPr>
+        <w:t xml:space="preserve">, a net gain of 441,000 in a year when most other groups declined (</w:t>
+      </w:r>
+      <w:hyperlink w:history="1" r:id="rIdecivppsc7eujf1_nlv4sa">
+        <w:r>
+          <w:rPr>
+            <w:rStyle w:val="Hyperlink"/>
+            <w:sz w:val="22"/>
+            <w:szCs w:val="22"/>
+          </w:rPr>
+          <w:t xml:space="preserve">State of Hispanic Homeownership Report</w:t>
+        </w:r>
+      </w:hyperlink>
+      <w:r>
+        <w:rPr>
+          <w:sz w:val="22"/>
+          <w:szCs w:val="22"/>
+        </w:rPr>
+        <w:t xml:space="preserve">). The </w:t>
       </w:r>
       <w:r>
         <w:rPr>
@@ -296,66 +408,15 @@
           <w:sz w:val="22"/>
           <w:szCs w:val="22"/>
         </w:rPr>
-        <w:t xml:space="preserve">AREAA’s</w:t>
-      </w:r>
-      <w:r>
-        <w:rPr>
-          <w:sz w:val="22"/>
-          <w:szCs w:val="22"/>
-        </w:rPr>
-        <w:t xml:space="preserve"> </w:t>
-      </w:r>
-      <w:hyperlink w:history="1" r:id="rIdgjvfzvvonpo_pw0tzaehl">
-        <w:r>
-          <w:rPr>
-            <w:rStyle w:val="Hyperlink"/>
-            <w:sz w:val="22"/>
-            <w:szCs w:val="22"/>
-          </w:rPr>
-          <w:t xml:space="preserve">State of Asia America Report</w:t>
-        </w:r>
-      </w:hyperlink>
-      <w:r>
-        <w:rPr>
-          <w:sz w:val="22"/>
-          <w:szCs w:val="22"/>
-        </w:rPr>
-        <w:t xml:space="preserve"> documenting a multi-year </w:t>
-      </w:r>
-      <w:hyperlink w:history="1" r:id="rIdwpyp3k0m_36hkkl475gxl">
-        <w:r>
-          <w:rPr>
-            <w:rStyle w:val="Hyperlink"/>
-            <w:sz w:val="22"/>
-            <w:szCs w:val="22"/>
-          </w:rPr>
-          <w:t xml:space="preserve">surge in AAPI homeownership</w:t>
-        </w:r>
-      </w:hyperlink>
-      <w:r>
-        <w:rPr>
-          <w:sz w:val="22"/>
-          <w:szCs w:val="22"/>
-        </w:rPr>
-        <w:t xml:space="preserve">.</w:t>
-      </w:r>
-    </w:p>
-    <w:p>
-      <w:pPr>
-        <w:spacing w:after="160" w:line="288"/>
-      </w:pPr>
-      <w:r>
-        <w:rPr>
-          <w:sz w:val="22"/>
-          <w:szCs w:val="22"/>
-        </w:rPr>
-        <w:t xml:space="preserve">That is the real prize behind a remittance sponsorship. A customer who first trusts you to send $200 home is a future cardholder, depositor, and mortgage borrower, if the relationship is built in their language across every product. Sponsorship buys the reach; in-language experience turns a single transfer into a lifetime relationship.</w:t>
-      </w:r>
-    </w:p>
-    <w:p>
-      <w:pPr>
-        <w:spacing w:after="160" w:line="288"/>
-      </w:pPr>
+        <w:t xml:space="preserve">AAPI</w:t>
+      </w:r>
+      <w:r>
+        <w:rPr>
+          <w:sz w:val="22"/>
+          <w:szCs w:val="22"/>
+        </w:rPr>
+        <w:t xml:space="preserve"> community is on a parallel climb, with </w:t>
+      </w:r>
       <w:r>
         <w:rPr>
           <w:b/>
@@ -363,18 +424,99 @@
           <w:sz w:val="22"/>
           <w:szCs w:val="22"/>
         </w:rPr>
-        <w:t xml:space="preserve">Related reading: </w:t>
-      </w:r>
-      <w:hyperlink w:history="1" r:id="rIdxfxulhklsdhj_te8ceoz9">
-        <w:r>
-          <w:rPr>
-            <w:rStyle w:val="Hyperlink"/>
-            <w:sz w:val="22"/>
-            <w:szCs w:val="22"/>
-          </w:rPr>
-          <w:t xml:space="preserve">Buying Loyalty in a Second Language: What Capital One’s MLB Bet Teaches Banks About Multicultural Trust</w:t>
-        </w:r>
-      </w:hyperlink>
+        <w:t xml:space="preserve">AREAA's</w:t>
+      </w:r>
+      <w:r>
+        <w:rPr>
+          <w:sz w:val="22"/>
+          <w:szCs w:val="22"/>
+        </w:rPr>
+        <w:t xml:space="preserve"> </w:t>
+      </w:r>
+      <w:hyperlink w:history="1" r:id="rId8cdwci7ipzmhanlmgqbbr">
+        <w:r>
+          <w:rPr>
+            <w:rStyle w:val="Hyperlink"/>
+            <w:sz w:val="22"/>
+            <w:szCs w:val="22"/>
+          </w:rPr>
+          <w:t xml:space="preserve">State of Asia America Report</w:t>
+        </w:r>
+      </w:hyperlink>
+      <w:r>
+        <w:rPr>
+          <w:sz w:val="22"/>
+          <w:szCs w:val="22"/>
+        </w:rPr>
+        <w:t xml:space="preserve"> documenting a multi-year </w:t>
+      </w:r>
+      <w:hyperlink w:history="1" r:id="rIdf3__pfha-9y1fpa4b0l4v">
+        <w:r>
+          <w:rPr>
+            <w:rStyle w:val="Hyperlink"/>
+            <w:sz w:val="22"/>
+            <w:szCs w:val="22"/>
+          </w:rPr>
+          <w:t xml:space="preserve">surge in AAPI homeownership</w:t>
+        </w:r>
+      </w:hyperlink>
+      <w:r>
+        <w:rPr>
+          <w:sz w:val="22"/>
+          <w:szCs w:val="22"/>
+        </w:rPr>
+        <w:t xml:space="preserve">.</w:t>
+      </w:r>
+    </w:p>
+    <w:p>
+      <w:pPr>
+        <w:spacing w:after="160" w:line="288"/>
+      </w:pPr>
+      <w:r>
+        <w:rPr>
+          <w:sz w:val="22"/>
+          <w:szCs w:val="22"/>
+        </w:rPr>
+        <w:t xml:space="preserve">That is the real prize behind a remittance sponsorship. A customer who first trusts you to send $200 home is a future cardholder, depositor, and mortgage borrower, if the relationship is built in their language across every product. Sponsorship buys the reach; in-language experience turns a single transfer into a lifetime relationship.</w:t>
+      </w:r>
+    </w:p>
+    <w:p>
+      <w:pPr>
+        <w:spacing w:after="160" w:line="288"/>
+      </w:pPr>
+      <w:r>
+        <w:rPr>
+          <w:b/>
+          <w:bCs/>
+          <w:sz w:val="22"/>
+          <w:szCs w:val="22"/>
+        </w:rPr>
+        <w:t xml:space="preserve">Related reading:</w:t>
+      </w:r>
+      <w:r>
+        <w:rPr>
+          <w:sz w:val="22"/>
+          <w:szCs w:val="22"/>
+        </w:rPr>
+        <w:t xml:space="preserve"> </w:t>
+      </w:r>
+      <w:hyperlink w:history="1" r:id="rIdq6fyfxr-vu15x70klz3zn">
+        <w:r>
+          <w:rPr>
+            <w:rStyle w:val="Hyperlink"/>
+            <w:sz w:val="22"/>
+            <w:szCs w:val="22"/>
+          </w:rPr>
+          <w:t xml:space="preserve">Buying Loyalty in a Second Language: What Capital One's MLB Bet Teaches Banks About Multicultural Trust</w:t>
+        </w:r>
+      </w:hyperlink>
+      <w:r>
+        <w:rPr>
+          <w:sz w:val="22"/>
+          <w:szCs w:val="22"/>
+        </w:rPr>
+        <w:t xml:space="preserve"> </w:t>
+      </w:r>
       <w:r>
         <w:rPr>
           <w:i/>
@@ -382,7 +524,14 @@
           <w:sz w:val="22"/>
           <w:szCs w:val="22"/>
         </w:rPr>
-        <w:t xml:space="preserve"> (swap for live URL), our take on why language is the conversion layer most issuers aren’t pricing.</w:t>
+        <w:t xml:space="preserve">(swap for live URL)</w:t>
+      </w:r>
+      <w:r>
+        <w:rPr>
+          <w:sz w:val="22"/>
+          <w:szCs w:val="22"/>
+        </w:rPr>
+        <w:t xml:space="preserve">, our take on why language is the conversion layer most issuers aren't pricing.</w:t>
       </w:r>
     </w:p>
     <w:p>
@@ -390,7 +539,7 @@
         <w:pBdr>
           <w:bottom w:val="single" w:color="CCCCCC" w:sz="6" w:space="1"/>
         </w:pBdr>
-        <w:spacing w:after="160" w:before="160"/>
+        <w:spacing w:after="120" w:before="120"/>
       </w:pPr>
       <w:r>
         <w:t xml:space="preserve"/>
@@ -407,25 +556,15 @@
           <w:sz w:val="22"/>
           <w:szCs w:val="22"/>
         </w:rPr>
-        <w:t xml:space="preserve">TransPerfect helps banks, card issuers, fintechs, and money-transfer providers deliver secure, compliant, in-language customer experiences at scale, from onboarding and apps to servicing and disclosures. </w:t>
-      </w:r>
-      <w:hyperlink w:history="1" r:id="rIdsoygr366aeeollyqqbiiu">
-        <w:r>
-          <w:rPr>
-            <w:rStyle w:val="Hyperlink"/>
-            <w:sz w:val="22"/>
-            <w:szCs w:val="22"/>
-          </w:rPr>
-          <w:t xml:space="preserve">Explore our finance and banking language solutions »</w:t>
-        </w:r>
-      </w:hyperlink>
+        <w:t xml:space="preserve">TransPerfect helps banks, card issuers, fintechs, and money-transfer providers deliver secure, compliant, in-language customer experiences at scale, from onboarding and apps to servicing and disclosures. [Explore our finance and banking language solutions »](https://www.transperfect.com/industries/finance-and-banking)</w:t>
+      </w:r>
     </w:p>
     <w:p>
       <w:pPr>
         <w:pBdr>
           <w:bottom w:val="single" w:color="CCCCCC" w:sz="6" w:space="1"/>
         </w:pBdr>
-        <w:spacing w:after="160" w:before="160"/>
+        <w:spacing w:after="120" w:before="120"/>
       </w:pPr>
       <w:r>
         <w:t xml:space="preserve"/>
@@ -433,15 +572,15 @@
     </w:p>
     <w:p>
       <w:pPr>
-        <w:spacing w:after="120"/>
+        <w:spacing w:after="120" w:before="280"/>
       </w:pPr>
       <w:r>
         <w:rPr>
           <w:b/>
           <w:bCs/>
           <w:color w:val="4B3FBF"/>
-          <w:sz w:val="26"/>
-          <w:szCs w:val="26"/>
+          <w:sz w:val="28"/>
+          <w:szCs w:val="28"/>
         </w:rPr>
         <w:t xml:space="preserve">Sources</w:t>
       </w:r>
@@ -453,57 +592,57 @@
           <w:ilvl w:val="0"/>
           <w:numId w:val="2"/>
         </w:numPr>
-        <w:spacing w:after="110" w:line="276"/>
-      </w:pPr>
-      <w:r>
-        <w:rPr>
-          <w:sz w:val="20"/>
-          <w:szCs w:val="20"/>
-        </w:rPr>
-        <w:t xml:space="preserve">NYCFC Announce Viamericas as Official International Money Transfer &amp; Remittance Partner (Aug 11, 2026): </w:t>
-      </w:r>
-      <w:hyperlink w:history="1" r:id="rId0_13ebfjvepmdwakveiru">
-        <w:r>
-          <w:rPr>
-            <w:rStyle w:val="Hyperlink"/>
-            <w:sz w:val="20"/>
-            <w:szCs w:val="20"/>
+        <w:spacing w:after="100" w:line="288"/>
+      </w:pPr>
+      <w:r>
+        <w:rPr>
+          <w:sz w:val="22"/>
+          <w:szCs w:val="22"/>
+        </w:rPr>
+        <w:t xml:space="preserve">New York City FC Announce Viamericas as Official International Money Transfer &amp; Remittance Partner (Aug 11, 2026): </w:t>
+      </w:r>
+      <w:hyperlink w:history="1" r:id="rIdfw4ue5qz1fi3wom_uk3mg">
+        <w:r>
+          <w:rPr>
+            <w:rStyle w:val="Hyperlink"/>
+            <w:sz w:val="22"/>
+            <w:szCs w:val="22"/>
           </w:rPr>
           <w:t xml:space="preserve">Yahoo Finance</w:t>
         </w:r>
       </w:hyperlink>
       <w:r>
         <w:rPr>
-          <w:sz w:val="20"/>
-          <w:szCs w:val="20"/>
-        </w:rPr>
-        <w:t xml:space="preserve">  ·  </w:t>
-      </w:r>
-      <w:hyperlink w:history="1" r:id="rIdoaogawykd_urlvjmohtlw">
-        <w:r>
-          <w:rPr>
-            <w:rStyle w:val="Hyperlink"/>
-            <w:sz w:val="20"/>
-            <w:szCs w:val="20"/>
+          <w:sz w:val="22"/>
+          <w:szCs w:val="22"/>
+        </w:rPr>
+        <w:t xml:space="preserve"> · </w:t>
+      </w:r>
+      <w:hyperlink w:history="1" r:id="rIdyqbskgftosspnin2_3pw2">
+        <w:r>
+          <w:rPr>
+            <w:rStyle w:val="Hyperlink"/>
+            <w:sz w:val="22"/>
+            <w:szCs w:val="22"/>
           </w:rPr>
           <w:t xml:space="preserve">OurSports Central</w:t>
         </w:r>
       </w:hyperlink>
       <w:r>
         <w:rPr>
-          <w:sz w:val="20"/>
-          <w:szCs w:val="20"/>
-        </w:rPr>
-        <w:t xml:space="preserve">  ·  </w:t>
-      </w:r>
-      <w:hyperlink w:history="1" r:id="rIdtcvcxhgo8g4hgqeidaaqd">
-        <w:r>
-          <w:rPr>
-            <w:rStyle w:val="Hyperlink"/>
-            <w:sz w:val="20"/>
-            <w:szCs w:val="20"/>
-          </w:rPr>
-          <w:t xml:space="preserve">BusinessWire</w:t>
+          <w:sz w:val="22"/>
+          <w:szCs w:val="22"/>
+        </w:rPr>
+        <w:t xml:space="preserve"> · </w:t>
+      </w:r>
+      <w:hyperlink w:history="1" r:id="rIdkz6fxi2ku78-9rjhgeecv">
+        <w:r>
+          <w:rPr>
+            <w:rStyle w:val="Hyperlink"/>
+            <w:sz w:val="22"/>
+            <w:szCs w:val="22"/>
+          </w:rPr>
+          <w:t xml:space="preserve">BusinessWire release</w:t>
         </w:r>
       </w:hyperlink>
     </w:p>
@@ -514,38 +653,38 @@
           <w:ilvl w:val="0"/>
           <w:numId w:val="2"/>
         </w:numPr>
-        <w:spacing w:after="110" w:line="276"/>
-      </w:pPr>
-      <w:r>
-        <w:rPr>
-          <w:sz w:val="20"/>
-          <w:szCs w:val="20"/>
+        <w:spacing w:after="100" w:line="288"/>
+      </w:pPr>
+      <w:r>
+        <w:rPr>
+          <w:sz w:val="22"/>
+          <w:szCs w:val="22"/>
         </w:rPr>
         <w:t xml:space="preserve">Viamericas Raises $113.6M to Expand Global Remittance Network Serving 95 Countries (Sep 2025): </w:t>
       </w:r>
-      <w:hyperlink w:history="1" r:id="rId78zjfccrgsq8qg2bw6sr6">
-        <w:r>
-          <w:rPr>
-            <w:rStyle w:val="Hyperlink"/>
-            <w:sz w:val="20"/>
-            <w:szCs w:val="20"/>
+      <w:hyperlink w:history="1" r:id="rId9_as9pgwu2ddhz8rdfqig">
+        <w:r>
+          <w:rPr>
+            <w:rStyle w:val="Hyperlink"/>
+            <w:sz w:val="22"/>
+            <w:szCs w:val="22"/>
           </w:rPr>
           <w:t xml:space="preserve">Viamericas</w:t>
         </w:r>
       </w:hyperlink>
       <w:r>
         <w:rPr>
-          <w:sz w:val="20"/>
-          <w:szCs w:val="20"/>
-        </w:rPr>
-        <w:t xml:space="preserve">  ·  </w:t>
-      </w:r>
-      <w:hyperlink w:history="1" r:id="rIdmk9g2ydxqcozmfjhyk9z_">
-        <w:r>
-          <w:rPr>
-            <w:rStyle w:val="Hyperlink"/>
-            <w:sz w:val="20"/>
-            <w:szCs w:val="20"/>
+          <w:sz w:val="22"/>
+          <w:szCs w:val="22"/>
+        </w:rPr>
+        <w:t xml:space="preserve"> · </w:t>
+      </w:r>
+      <w:hyperlink w:history="1" r:id="rId55z_jgzvp4rrbz_kok8iz">
+        <w:r>
+          <w:rPr>
+            <w:rStyle w:val="Hyperlink"/>
+            <w:sz w:val="22"/>
+            <w:szCs w:val="22"/>
           </w:rPr>
           <w:t xml:space="preserve">FinTech Futures</w:t>
         </w:r>
@@ -558,40 +697,40 @@
           <w:ilvl w:val="0"/>
           <w:numId w:val="2"/>
         </w:numPr>
-        <w:spacing w:after="110" w:line="276"/>
-      </w:pPr>
-      <w:r>
-        <w:rPr>
-          <w:sz w:val="20"/>
-          <w:szCs w:val="20"/>
-        </w:rPr>
-        <w:t xml:space="preserve">NAHREP, 2025 State of Hispanic Homeownership Report (record 10.2M Hispanic homeowners): </w:t>
-      </w:r>
-      <w:hyperlink w:history="1" r:id="rIdfdhoteibz5mvc3n-6gqs2">
-        <w:r>
-          <w:rPr>
-            <w:rStyle w:val="Hyperlink"/>
-            <w:sz w:val="20"/>
-            <w:szCs w:val="20"/>
-          </w:rPr>
-          <w:t xml:space="preserve">Report</w:t>
-        </w:r>
-      </w:hyperlink>
-      <w:r>
-        <w:rPr>
-          <w:sz w:val="20"/>
-          <w:szCs w:val="20"/>
-        </w:rPr>
-        <w:t xml:space="preserve">  ·  </w:t>
-      </w:r>
-      <w:hyperlink w:history="1" r:id="rIdfkyq5gjcca_n6ogp1t02k">
-        <w:r>
-          <w:rPr>
-            <w:rStyle w:val="Hyperlink"/>
-            <w:sz w:val="20"/>
-            <w:szCs w:val="20"/>
-          </w:rPr>
-          <w:t xml:space="preserve">Press release</w:t>
+        <w:spacing w:after="100" w:line="288"/>
+      </w:pPr>
+      <w:r>
+        <w:rPr>
+          <w:sz w:val="22"/>
+          <w:szCs w:val="22"/>
+        </w:rPr>
+        <w:t xml:space="preserve">Revolut, Audi F1 title partnership and the Como 1907 show-car activation: </w:t>
+      </w:r>
+      <w:hyperlink w:history="1" r:id="rId4ksbmjhomezlgzxzuv0fi">
+        <w:r>
+          <w:rPr>
+            <w:rStyle w:val="Hyperlink"/>
+            <w:sz w:val="22"/>
+            <w:szCs w:val="22"/>
+          </w:rPr>
+          <w:t xml:space="preserve">Formula 1</w:t>
+        </w:r>
+      </w:hyperlink>
+      <w:r>
+        <w:rPr>
+          <w:sz w:val="22"/>
+          <w:szCs w:val="22"/>
+        </w:rPr>
+        <w:t xml:space="preserve"> · </w:t>
+      </w:r>
+      <w:hyperlink w:history="1" r:id="rId2lwxijwvq2siv83bzzrdt">
+        <w:r>
+          <w:rPr>
+            <w:rStyle w:val="Hyperlink"/>
+            <w:sz w:val="22"/>
+            <w:szCs w:val="22"/>
+          </w:rPr>
+          <w:t xml:space="preserve">Media Key</w:t>
         </w:r>
       </w:hyperlink>
     </w:p>
@@ -602,40 +741,23 @@
           <w:ilvl w:val="0"/>
           <w:numId w:val="2"/>
         </w:numPr>
-        <w:spacing w:after="110" w:line="276"/>
-      </w:pPr>
-      <w:r>
-        <w:rPr>
-          <w:sz w:val="20"/>
-          <w:szCs w:val="20"/>
-        </w:rPr>
-        <w:t xml:space="preserve">AREAA, State of Asia America Report (AAPI homeownership surge): </w:t>
-      </w:r>
-      <w:hyperlink w:history="1" r:id="rIdc-zhfamillie4uckcpv6e">
-        <w:r>
-          <w:rPr>
-            <w:rStyle w:val="Hyperlink"/>
-            <w:sz w:val="20"/>
-            <w:szCs w:val="20"/>
-          </w:rPr>
-          <w:t xml:space="preserve">AREAA</w:t>
-        </w:r>
-      </w:hyperlink>
-      <w:r>
-        <w:rPr>
-          <w:sz w:val="20"/>
-          <w:szCs w:val="20"/>
-        </w:rPr>
-        <w:t xml:space="preserve">  ·  </w:t>
-      </w:r>
-      <w:hyperlink w:history="1" r:id="rId2-wvf271a-_n57rifhyhy">
-        <w:r>
-          <w:rPr>
-            <w:rStyle w:val="Hyperlink"/>
-            <w:sz w:val="20"/>
-            <w:szCs w:val="20"/>
-          </w:rPr>
-          <w:t xml:space="preserve">NAR coverage</w:t>
+        <w:spacing w:after="100" w:line="288"/>
+      </w:pPr>
+      <w:r>
+        <w:rPr>
+          <w:sz w:val="22"/>
+          <w:szCs w:val="22"/>
+        </w:rPr>
+        <w:t xml:space="preserve">Ria Money Transfer, official remittance partner of Mexico's national teams (2026): </w:t>
+      </w:r>
+      <w:hyperlink w:history="1" r:id="rIdboq15gjl7agvedkprvmr2">
+        <w:r>
+          <w:rPr>
+            <w:rStyle w:val="Hyperlink"/>
+            <w:sz w:val="22"/>
+            <w:szCs w:val="22"/>
+          </w:rPr>
+          <w:t xml:space="preserve">Euronet</w:t>
         </w:r>
       </w:hyperlink>
     </w:p>
@@ -646,34 +768,150 @@
           <w:ilvl w:val="0"/>
           <w:numId w:val="2"/>
         </w:numPr>
-        <w:spacing w:after="110" w:line="276"/>
-      </w:pPr>
-      <w:r>
-        <w:rPr>
-          <w:sz w:val="20"/>
-          <w:szCs w:val="20"/>
+        <w:spacing w:after="100" w:line="288"/>
+      </w:pPr>
+      <w:r>
+        <w:rPr>
+          <w:sz w:val="22"/>
+          <w:szCs w:val="22"/>
+        </w:rPr>
+        <w:t xml:space="preserve">Intermex, Official International Remittance Partner of the LA Galaxy (~70% Latino MLS viewership in California): </w:t>
+      </w:r>
+      <w:hyperlink w:history="1" r:id="rIdqx7xyqrtsnzbfpvrut_qz">
+        <w:r>
+          <w:rPr>
+            <w:rStyle w:val="Hyperlink"/>
+            <w:sz w:val="22"/>
+            <w:szCs w:val="22"/>
+          </w:rPr>
+          <w:t xml:space="preserve">Intermex</w:t>
+        </w:r>
+      </w:hyperlink>
+    </w:p>
+    <w:p>
+      <w:pPr>
+        <w:pStyle w:val="ListParagraph"/>
+        <w:numPr>
+          <w:ilvl w:val="0"/>
+          <w:numId w:val="2"/>
+        </w:numPr>
+        <w:spacing w:after="100" w:line="288"/>
+      </w:pPr>
+      <w:r>
+        <w:rPr>
+          <w:sz w:val="22"/>
+          <w:szCs w:val="22"/>
+        </w:rPr>
+        <w:t xml:space="preserve">NAHREP, 2025 State of Hispanic Homeownership Report (record 10.2M Hispanic homeowners): </w:t>
+      </w:r>
+      <w:hyperlink w:history="1" r:id="rIdz_t4tlqtce-e2kfakzdpo">
+        <w:r>
+          <w:rPr>
+            <w:rStyle w:val="Hyperlink"/>
+            <w:sz w:val="22"/>
+            <w:szCs w:val="22"/>
+          </w:rPr>
+          <w:t xml:space="preserve">Report</w:t>
+        </w:r>
+      </w:hyperlink>
+      <w:r>
+        <w:rPr>
+          <w:sz w:val="22"/>
+          <w:szCs w:val="22"/>
+        </w:rPr>
+        <w:t xml:space="preserve"> · </w:t>
+      </w:r>
+      <w:hyperlink w:history="1" r:id="rId7ce0fopkcbtqhilful5gg">
+        <w:r>
+          <w:rPr>
+            <w:rStyle w:val="Hyperlink"/>
+            <w:sz w:val="22"/>
+            <w:szCs w:val="22"/>
+          </w:rPr>
+          <w:t xml:space="preserve">Press release</w:t>
+        </w:r>
+      </w:hyperlink>
+    </w:p>
+    <w:p>
+      <w:pPr>
+        <w:pStyle w:val="ListParagraph"/>
+        <w:numPr>
+          <w:ilvl w:val="0"/>
+          <w:numId w:val="2"/>
+        </w:numPr>
+        <w:spacing w:after="100" w:line="288"/>
+      </w:pPr>
+      <w:r>
+        <w:rPr>
+          <w:sz w:val="22"/>
+          <w:szCs w:val="22"/>
+        </w:rPr>
+        <w:t xml:space="preserve">AREAA, State of Asia America Report (AAPI homeownership surge): </w:t>
+      </w:r>
+      <w:hyperlink w:history="1" r:id="rId-6getfuxxb4cjgjnkvxry">
+        <w:r>
+          <w:rPr>
+            <w:rStyle w:val="Hyperlink"/>
+            <w:sz w:val="22"/>
+            <w:szCs w:val="22"/>
+          </w:rPr>
+          <w:t xml:space="preserve">AREAA</w:t>
+        </w:r>
+      </w:hyperlink>
+      <w:r>
+        <w:rPr>
+          <w:sz w:val="22"/>
+          <w:szCs w:val="22"/>
+        </w:rPr>
+        <w:t xml:space="preserve"> · </w:t>
+      </w:r>
+      <w:hyperlink w:history="1" r:id="rIdkwbfkq7s2iqfccdtuoxje">
+        <w:r>
+          <w:rPr>
+            <w:rStyle w:val="Hyperlink"/>
+            <w:sz w:val="22"/>
+            <w:szCs w:val="22"/>
+          </w:rPr>
+          <w:t xml:space="preserve">NAR coverage</w:t>
+        </w:r>
+      </w:hyperlink>
+    </w:p>
+    <w:p>
+      <w:pPr>
+        <w:pStyle w:val="ListParagraph"/>
+        <w:numPr>
+          <w:ilvl w:val="0"/>
+          <w:numId w:val="2"/>
+        </w:numPr>
+        <w:spacing w:after="100" w:line="288"/>
+      </w:pPr>
+      <w:r>
+        <w:rPr>
+          <w:sz w:val="22"/>
+          <w:szCs w:val="22"/>
         </w:rPr>
         <w:t xml:space="preserve">Related: </w:t>
       </w:r>
-      <w:hyperlink w:history="1" r:id="rIdfwdwjwp338c1lvi8c4a0h">
-        <w:r>
-          <w:rPr>
-            <w:rStyle w:val="Hyperlink"/>
-            <w:sz w:val="20"/>
-            <w:szCs w:val="20"/>
+      <w:hyperlink w:history="1" r:id="rIdov5y8r_ox7p9eesjkxe2z">
+        <w:r>
+          <w:rPr>
+            <w:rStyle w:val="Hyperlink"/>
+            <w:sz w:val="22"/>
+            <w:szCs w:val="22"/>
           </w:rPr>
           <w:t xml:space="preserve">Buying Loyalty in a Second Language</w:t>
         </w:r>
       </w:hyperlink>
       <w:r>
         <w:rPr>
-          <w:sz w:val="20"/>
-          <w:szCs w:val="20"/>
+          <w:sz w:val="22"/>
+          <w:szCs w:val="22"/>
         </w:rPr>
         <w:t xml:space="preserve"> (TransPerfect)</w:t>
       </w:r>
     </w:p>
     <w:sectPr>
+      <w:footerReference w:type="default" r:id="rId7"/>
       <w:pgSz w:w="12240" w:h="15840" w:orient="portrait"/>
       <w:pgMar w:top="1440" w:right="1440" w:bottom="1440" w:left="1440" w:header="708" w:footer="708" w:gutter="0"/>
       <w:pgNumType/>
@@ -722,6 +960,28 @@
     </w:p>
   </w:endnote>
 </w:endnotes>
+</file>
+
+<file path=word/footer1.xml><?xml version="1.0" encoding="utf-8"?>
+<w:ftr xmlns:wpc="http://schemas.microsoft.com/office/word/2010/wordprocessingCanvas" xmlns:mc="http://schemas.openxmlformats.org/markup-compatibility/2006" xmlns:o="urn:schemas-microsoft-com:office:office" xmlns:r="http://schemas.openxmlformats.org/officeDocument/2006/relationships" xmlns:m="http://schemas.openxmlformats.org/officeDocument/2006/math" xmlns:v="urn:schemas-microsoft-com:vml" xmlns:wp14="http://schemas.microsoft.com/office/word/2010/wordprocessingDrawing" xmlns:wp="http://schemas.openxmlformats.org/drawingml/2006/wordprocessingDrawing" xmlns:w10="urn:schemas-microsoft-com:office:word" xmlns:w="http://schemas.openxmlformats.org/wordprocessingml/2006/main" xmlns:w14="http://schemas.microsoft.com/office/word/2010/wordml" xmlns:w15="http://schemas.microsoft.com/office/word/2012/wordml" xmlns:wpg="http://schemas.microsoft.com/office/word/2010/wordprocessingGroup" xmlns:wpi="http://schemas.microsoft.com/office/word/2010/wordprocessingInk" xmlns:wne="http://schemas.microsoft.com/office/word/2006/wordml" xmlns:wps="http://schemas.microsoft.com/office/word/2010/wordprocessingShape">
+  <w:p>
+    <w:pPr>
+      <w:jc w:val="center"/>
+    </w:pPr>
+    <w:r>
+      <w:rPr>
+        <w:color w:val="888888"/>
+        <w:sz w:val="18"/>
+        <w:szCs w:val="18"/>
+      </w:rPr>
+      <w:t xml:space="preserve">Page </w:t>
+      <w:fldChar w:fldCharType="begin"/>
+      <w:instrText xml:space="preserve">PAGE</w:instrText>
+      <w:fldChar w:fldCharType="separate"/>
+      <w:fldChar w:fldCharType="end"/>
+    </w:r>
+  </w:p>
+</w:ftr>
 </file>
 
 <file path=word/footnotes.xml><?xml version="1.0" encoding="utf-8"?>

</xml_diff>

<commit_message>
Add Revolut front-of-shirt upgrade detail to Viamericas post
Reflect that Revolut upgraded its Como 1907 deal to front-of-shirt
sponsor for 2026/27 (from banking partner), and note the fan pre-sales,
co-branded products, and product integration that reinforce the "wired
into the customer journey, not a billboard" framing. Add Como 1907 /
Ministry of Sport sources. Kept Italy as a fast-growing market
(qualitative) rather than assert the unverified 5M figure. No em dashes.

Co-Authored-By: Claude Opus 4.8 <noreply@anthropic.com>
Claude-Session: https://claude.ai/code/session_01WdmaS8fb3WHmxD5MVo6UfL
</commit_message>
<xml_diff>
--- a/blog/NYCFC-Viamericas-Remittance-Partner.docx
+++ b/blog/NYCFC-Viamericas-Remittance-Partner.docx
@@ -83,7 +83,7 @@
         </w:rPr>
         <w:t xml:space="preserve"> its Official International Money Transfer and Remittance Partner, the club </w:t>
       </w:r>
-      <w:hyperlink w:history="1" r:id="rIdmvzgjto8wrswlejygwwar">
+      <w:hyperlink w:history="1" r:id="rId5ktosxiqsphy2ont3nh1v">
         <w:r>
           <w:rPr>
             <w:rStyle w:val="Hyperlink"/>
@@ -100,7 +100,7 @@
         </w:rPr>
         <w:t xml:space="preserve">. The deal gives Viamericas a prominent, first-of-its-kind spot: its brand becomes the </w:t>
       </w:r>
-      <w:hyperlink w:history="1" r:id="rIdmlzskysagxzpalcrl0anp">
+      <w:hyperlink w:history="1" r:id="rIdybdvbjxr7oba5tec2-oco">
         <w:r>
           <w:rPr>
             <w:rStyle w:val="Hyperlink"/>
@@ -138,7 +138,7 @@
         </w:rPr>
         <w:t xml:space="preserve"> Viamericas is one of the largest licensed U.S. money transfer companies, serving families across </w:t>
       </w:r>
-      <w:hyperlink w:history="1" r:id="rIdmccea-fe6sk_wbv8kysi_">
+      <w:hyperlink w:history="1" r:id="rIdktep-c4gmybj0rbvgzvqc">
         <w:r>
           <w:rPr>
             <w:rStyle w:val="Hyperlink"/>
@@ -176,7 +176,7 @@
         </w:rPr>
         <w:t xml:space="preserve"> The NYCFC sponsorship lands amid an aggressive growth push. In September 2025, Viamericas </w:t>
       </w:r>
-      <w:hyperlink w:history="1" r:id="rIdn7dbw-xbroxdlvhdp6u4c">
+      <w:hyperlink w:history="1" r:id="rIdw-vb8y78tizotihyypbih">
         <w:r>
           <w:rPr>
             <w:rStyle w:val="Hyperlink"/>
@@ -230,9 +230,9 @@
           <w:sz w:val="22"/>
           <w:szCs w:val="22"/>
         </w:rPr>
-        <w:t xml:space="preserve">The most eye-catching example came this fall from Revolut. Having become the </w:t>
-      </w:r>
-      <w:hyperlink w:history="1" r:id="rId9f3s4geb-xemjmvuhkkcu">
+        <w:t xml:space="preserve">The most eye-catching example came this fall from Revolut. The </w:t>
+      </w:r>
+      <w:hyperlink w:history="1" r:id="rIdiullmnm2knzu_5ff2aao7">
         <w:r>
           <w:rPr>
             <w:rStyle w:val="Hyperlink"/>
@@ -247,9 +247,26 @@
           <w:sz w:val="22"/>
           <w:szCs w:val="22"/>
         </w:rPr>
-        <w:t xml:space="preserve"> and, over the summer, a sponsor of Serie A's Como 1907, Revolut parked the Audi Revolut F1 show car </w:t>
-      </w:r>
-      <w:hyperlink w:history="1" r:id="rIdobnsjk2zc2_xokonp6jos">
+        <w:t xml:space="preserve"> has been steadily assembling a sports portfolio, and it just </w:t>
+      </w:r>
+      <w:hyperlink w:history="1" r:id="rIdyo1uiasm008b0gnuel8_-">
+        <w:r>
+          <w:rPr>
+            <w:rStyle w:val="Hyperlink"/>
+            <w:sz w:val="22"/>
+            <w:szCs w:val="22"/>
+          </w:rPr>
+          <w:t xml:space="preserve">upgraded its Serie A deal with Como 1907 to front-of-shirt sponsor for the 2026/27 season</w:t>
+        </w:r>
+      </w:hyperlink>
+      <w:r>
+        <w:rPr>
+          <w:sz w:val="22"/>
+          <w:szCs w:val="22"/>
+        </w:rPr>
+        <w:t xml:space="preserve">, moving from the club's banking partner to the name across its chest. To activate the tie-up, Revolut parked the Audi Revolut F1 show car </w:t>
+      </w:r>
+      <w:hyperlink w:history="1" r:id="rIdlepvlhltvzyb9c-vqlgde">
         <w:r>
           <w:rPr>
             <w:rStyle w:val="Hyperlink"/>
@@ -264,7 +281,7 @@
           <w:sz w:val="22"/>
           <w:szCs w:val="22"/>
         </w:rPr>
-        <w:t xml:space="preserve">, fusing Formula 1 and Italian football into a single activation people actually stop to photograph. It is a small stunt with a big idea behind it: a fintech getting more out of its sports portfolio, which also spans Manchester City and rugby's Stade Toulousain, by making the partnerships work together rather than stand alone.</w:t>
+        <w:t xml:space="preserve">, fusing Formula 1 and Italian football into a single moment people actually stop to photograph. And the Como deal is more than a logo: it bundles exclusive fan ticket pre-sales, co-branded products, and deeper product integration in one of Revolut's fastest-growing markets. That is the tell. A fintech gets more from its portfolio, which also spans Manchester City and rugby's Stade Toulousain, by wiring partnerships into the customer journey rather than leaving them to stand alone.</w:t>
       </w:r>
     </w:p>
     <w:p>
@@ -278,7 +295,7 @@
         </w:rPr>
         <w:t xml:space="preserve">Underneath the spectacle runs a quieter, more targeted current, and it is the one Viamericas is riding: money-movement brands going precisely where their customers already are. In 2026, </w:t>
       </w:r>
-      <w:hyperlink w:history="1" r:id="rId6l0ecrtwtoveasrfiwfa2">
+      <w:hyperlink w:history="1" r:id="rId6-dxuu8sw4o49dalcqxkk">
         <w:r>
           <w:rPr>
             <w:rStyle w:val="Hyperlink"/>
@@ -295,7 +312,7 @@
         </w:rPr>
         <w:t xml:space="preserve">, and </w:t>
       </w:r>
-      <w:hyperlink w:history="1" r:id="rIdzp556-xsq2yairhecml0i">
+      <w:hyperlink w:history="1" r:id="rId8ixm3oj72nbtsq1zukdqb">
         <w:r>
           <w:rPr>
             <w:rStyle w:val="Hyperlink"/>
@@ -367,7 +384,7 @@
         </w:rPr>
         <w:t xml:space="preserve">, Hispanics reached a </w:t>
       </w:r>
-      <w:hyperlink w:history="1" r:id="rIdeompaethyutkf_rclcuwo">
+      <w:hyperlink w:history="1" r:id="rIdcdygapswlvgy4md-lyhot">
         <w:r>
           <w:rPr>
             <w:rStyle w:val="Hyperlink"/>
@@ -384,7 +401,7 @@
         </w:rPr>
         <w:t xml:space="preserve">, a net gain of 441,000 in a year when most other groups declined (</w:t>
       </w:r>
-      <w:hyperlink w:history="1" r:id="rIdecivppsc7eujf1_nlv4sa">
+      <w:hyperlink w:history="1" r:id="rIdy6kv2f9wlwzcjtuiqovyq">
         <w:r>
           <w:rPr>
             <w:rStyle w:val="Hyperlink"/>
@@ -433,7 +450,7 @@
         </w:rPr>
         <w:t xml:space="preserve"> </w:t>
       </w:r>
-      <w:hyperlink w:history="1" r:id="rId8cdwci7ipzmhanlmgqbbr">
+      <w:hyperlink w:history="1" r:id="rIdxklffdqsp4edvyq_6ni9o">
         <w:r>
           <w:rPr>
             <w:rStyle w:val="Hyperlink"/>
@@ -450,7 +467,7 @@
         </w:rPr>
         <w:t xml:space="preserve"> documenting a multi-year </w:t>
       </w:r>
-      <w:hyperlink w:history="1" r:id="rIdf3__pfha-9y1fpa4b0l4v">
+      <w:hyperlink w:history="1" r:id="rIduv6xoyp3cb6r-fkgfq--y">
         <w:r>
           <w:rPr>
             <w:rStyle w:val="Hyperlink"/>
@@ -500,7 +517,7 @@
         </w:rPr>
         <w:t xml:space="preserve"> </w:t>
       </w:r>
-      <w:hyperlink w:history="1" r:id="rIdq6fyfxr-vu15x70klz3zn">
+      <w:hyperlink w:history="1" r:id="rIdpczmqcdv3lmqvujzjvotz">
         <w:r>
           <w:rPr>
             <w:rStyle w:val="Hyperlink"/>
@@ -601,7 +618,7 @@
         </w:rPr>
         <w:t xml:space="preserve">New York City FC Announce Viamericas as Official International Money Transfer &amp; Remittance Partner (Aug 11, 2026): </w:t>
       </w:r>
-      <w:hyperlink w:history="1" r:id="rIdfw4ue5qz1fi3wom_uk3mg">
+      <w:hyperlink w:history="1" r:id="rIdjwqqp7yeec5agusbfe7i_">
         <w:r>
           <w:rPr>
             <w:rStyle w:val="Hyperlink"/>
@@ -618,7 +635,7 @@
         </w:rPr>
         <w:t xml:space="preserve"> · </w:t>
       </w:r>
-      <w:hyperlink w:history="1" r:id="rIdyqbskgftosspnin2_3pw2">
+      <w:hyperlink w:history="1" r:id="rIdvj3pxkwf8bqcthqdzmspb">
         <w:r>
           <w:rPr>
             <w:rStyle w:val="Hyperlink"/>
@@ -635,7 +652,7 @@
         </w:rPr>
         <w:t xml:space="preserve"> · </w:t>
       </w:r>
-      <w:hyperlink w:history="1" r:id="rIdkz6fxi2ku78-9rjhgeecv">
+      <w:hyperlink w:history="1" r:id="rIdihh2hrwcyd4j-msn-ifof">
         <w:r>
           <w:rPr>
             <w:rStyle w:val="Hyperlink"/>
@@ -662,7 +679,7 @@
         </w:rPr>
         <w:t xml:space="preserve">Viamericas Raises $113.6M to Expand Global Remittance Network Serving 95 Countries (Sep 2025): </w:t>
       </w:r>
-      <w:hyperlink w:history="1" r:id="rId9_as9pgwu2ddhz8rdfqig">
+      <w:hyperlink w:history="1" r:id="rIdbnoj_fm22rb5px4xgtsvv">
         <w:r>
           <w:rPr>
             <w:rStyle w:val="Hyperlink"/>
@@ -679,7 +696,7 @@
         </w:rPr>
         <w:t xml:space="preserve"> · </w:t>
       </w:r>
-      <w:hyperlink w:history="1" r:id="rId55z_jgzvp4rrbz_kok8iz">
+      <w:hyperlink w:history="1" r:id="rIdzyge79sfa1mm0kb6kffim">
         <w:r>
           <w:rPr>
             <w:rStyle w:val="Hyperlink"/>
@@ -706,7 +723,7 @@
         </w:rPr>
         <w:t xml:space="preserve">Revolut, Audi F1 title partnership and the Como 1907 show-car activation: </w:t>
       </w:r>
-      <w:hyperlink w:history="1" r:id="rId4ksbmjhomezlgzxzuv0fi">
+      <w:hyperlink w:history="1" r:id="rIdnsvpqbi_jjnwzs8ng4oqy">
         <w:r>
           <w:rPr>
             <w:rStyle w:val="Hyperlink"/>
@@ -723,7 +740,7 @@
         </w:rPr>
         <w:t xml:space="preserve"> · </w:t>
       </w:r>
-      <w:hyperlink w:history="1" r:id="rId2lwxijwvq2siv83bzzrdt">
+      <w:hyperlink w:history="1" r:id="rId1cttt-36j3n4zfqlibudl">
         <w:r>
           <w:rPr>
             <w:rStyle w:val="Hyperlink"/>
@@ -748,16 +765,33 @@
           <w:sz w:val="22"/>
           <w:szCs w:val="22"/>
         </w:rPr>
-        <w:t xml:space="preserve">Ria Money Transfer, official remittance partner of Mexico's national teams (2026): </w:t>
-      </w:r>
-      <w:hyperlink w:history="1" r:id="rIdboq15gjl7agvedkprvmr2">
-        <w:r>
-          <w:rPr>
-            <w:rStyle w:val="Hyperlink"/>
-            <w:sz w:val="22"/>
-            <w:szCs w:val="22"/>
-          </w:rPr>
-          <w:t xml:space="preserve">Euronet</w:t>
+        <w:t xml:space="preserve">Revolut becomes Como 1907's front-of-shirt sponsor for 2026/27 (upgraded from banking partner; fan pre-sales, co-branded products, product integration): </w:t>
+      </w:r>
+      <w:hyperlink w:history="1" r:id="rIdo7lhsbru4jya6d1g_ontk">
+        <w:r>
+          <w:rPr>
+            <w:rStyle w:val="Hyperlink"/>
+            <w:sz w:val="22"/>
+            <w:szCs w:val="22"/>
+          </w:rPr>
+          <w:t xml:space="preserve">Como 1907</w:t>
+        </w:r>
+      </w:hyperlink>
+      <w:r>
+        <w:rPr>
+          <w:sz w:val="22"/>
+          <w:szCs w:val="22"/>
+        </w:rPr>
+        <w:t xml:space="preserve"> · </w:t>
+      </w:r>
+      <w:hyperlink w:history="1" r:id="rIdqemijvwn6ejwa1awf0oe0">
+        <w:r>
+          <w:rPr>
+            <w:rStyle w:val="Hyperlink"/>
+            <w:sz w:val="22"/>
+            <w:szCs w:val="22"/>
+          </w:rPr>
+          <w:t xml:space="preserve">Ministry of Sport</w:t>
         </w:r>
       </w:hyperlink>
     </w:p>
@@ -775,16 +809,16 @@
           <w:sz w:val="22"/>
           <w:szCs w:val="22"/>
         </w:rPr>
-        <w:t xml:space="preserve">Intermex, Official International Remittance Partner of the LA Galaxy (~70% Latino MLS viewership in California): </w:t>
-      </w:r>
-      <w:hyperlink w:history="1" r:id="rIdqx7xyqrtsnzbfpvrut_qz">
-        <w:r>
-          <w:rPr>
-            <w:rStyle w:val="Hyperlink"/>
-            <w:sz w:val="22"/>
-            <w:szCs w:val="22"/>
-          </w:rPr>
-          <w:t xml:space="preserve">Intermex</w:t>
+        <w:t xml:space="preserve">Ria Money Transfer, official remittance partner of Mexico's national teams (2026): </w:t>
+      </w:r>
+      <w:hyperlink w:history="1" r:id="rIdcp8hji8vl2k3i8en03yk5">
+        <w:r>
+          <w:rPr>
+            <w:rStyle w:val="Hyperlink"/>
+            <w:sz w:val="22"/>
+            <w:szCs w:val="22"/>
+          </w:rPr>
+          <w:t xml:space="preserve">Euronet</w:t>
         </w:r>
       </w:hyperlink>
     </w:p>
@@ -802,33 +836,16 @@
           <w:sz w:val="22"/>
           <w:szCs w:val="22"/>
         </w:rPr>
-        <w:t xml:space="preserve">NAHREP, 2025 State of Hispanic Homeownership Report (record 10.2M Hispanic homeowners): </w:t>
-      </w:r>
-      <w:hyperlink w:history="1" r:id="rIdz_t4tlqtce-e2kfakzdpo">
-        <w:r>
-          <w:rPr>
-            <w:rStyle w:val="Hyperlink"/>
-            <w:sz w:val="22"/>
-            <w:szCs w:val="22"/>
-          </w:rPr>
-          <w:t xml:space="preserve">Report</w:t>
-        </w:r>
-      </w:hyperlink>
-      <w:r>
-        <w:rPr>
-          <w:sz w:val="22"/>
-          <w:szCs w:val="22"/>
-        </w:rPr>
-        <w:t xml:space="preserve"> · </w:t>
-      </w:r>
-      <w:hyperlink w:history="1" r:id="rId7ce0fopkcbtqhilful5gg">
-        <w:r>
-          <w:rPr>
-            <w:rStyle w:val="Hyperlink"/>
-            <w:sz w:val="22"/>
-            <w:szCs w:val="22"/>
-          </w:rPr>
-          <w:t xml:space="preserve">Press release</w:t>
+        <w:t xml:space="preserve">Intermex, Official International Remittance Partner of the LA Galaxy (~70% Latino MLS viewership in California): </w:t>
+      </w:r>
+      <w:hyperlink w:history="1" r:id="rIduimjpsvlyxifbepsalr9s">
+        <w:r>
+          <w:rPr>
+            <w:rStyle w:val="Hyperlink"/>
+            <w:sz w:val="22"/>
+            <w:szCs w:val="22"/>
+          </w:rPr>
+          <w:t xml:space="preserve">Intermex</w:t>
         </w:r>
       </w:hyperlink>
     </w:p>
@@ -846,16 +863,16 @@
           <w:sz w:val="22"/>
           <w:szCs w:val="22"/>
         </w:rPr>
-        <w:t xml:space="preserve">AREAA, State of Asia America Report (AAPI homeownership surge): </w:t>
-      </w:r>
-      <w:hyperlink w:history="1" r:id="rId-6getfuxxb4cjgjnkvxry">
-        <w:r>
-          <w:rPr>
-            <w:rStyle w:val="Hyperlink"/>
-            <w:sz w:val="22"/>
-            <w:szCs w:val="22"/>
-          </w:rPr>
-          <w:t xml:space="preserve">AREAA</w:t>
+        <w:t xml:space="preserve">NAHREP, 2025 State of Hispanic Homeownership Report (record 10.2M Hispanic homeowners): </w:t>
+      </w:r>
+      <w:hyperlink w:history="1" r:id="rIdjjd2wfaqu-9l4gx462_su">
+        <w:r>
+          <w:rPr>
+            <w:rStyle w:val="Hyperlink"/>
+            <w:sz w:val="22"/>
+            <w:szCs w:val="22"/>
+          </w:rPr>
+          <w:t xml:space="preserve">Report</w:t>
         </w:r>
       </w:hyperlink>
       <w:r>
@@ -865,14 +882,14 @@
         </w:rPr>
         <w:t xml:space="preserve"> · </w:t>
       </w:r>
-      <w:hyperlink w:history="1" r:id="rIdkwbfkq7s2iqfccdtuoxje">
-        <w:r>
-          <w:rPr>
-            <w:rStyle w:val="Hyperlink"/>
-            <w:sz w:val="22"/>
-            <w:szCs w:val="22"/>
-          </w:rPr>
-          <w:t xml:space="preserve">NAR coverage</w:t>
+      <w:hyperlink w:history="1" r:id="rIdbzohxgljmoqwxxhmfy88n">
+        <w:r>
+          <w:rPr>
+            <w:rStyle w:val="Hyperlink"/>
+            <w:sz w:val="22"/>
+            <w:szCs w:val="22"/>
+          </w:rPr>
+          <w:t xml:space="preserve">Press release</w:t>
         </w:r>
       </w:hyperlink>
     </w:p>
@@ -890,9 +907,53 @@
           <w:sz w:val="22"/>
           <w:szCs w:val="22"/>
         </w:rPr>
+        <w:t xml:space="preserve">AREAA, State of Asia America Report (AAPI homeownership surge): </w:t>
+      </w:r>
+      <w:hyperlink w:history="1" r:id="rId6syc4nq9scb0xq7uab3i2">
+        <w:r>
+          <w:rPr>
+            <w:rStyle w:val="Hyperlink"/>
+            <w:sz w:val="22"/>
+            <w:szCs w:val="22"/>
+          </w:rPr>
+          <w:t xml:space="preserve">AREAA</w:t>
+        </w:r>
+      </w:hyperlink>
+      <w:r>
+        <w:rPr>
+          <w:sz w:val="22"/>
+          <w:szCs w:val="22"/>
+        </w:rPr>
+        <w:t xml:space="preserve"> · </w:t>
+      </w:r>
+      <w:hyperlink w:history="1" r:id="rIdel2nr5qdoaejn0qhv0amz">
+        <w:r>
+          <w:rPr>
+            <w:rStyle w:val="Hyperlink"/>
+            <w:sz w:val="22"/>
+            <w:szCs w:val="22"/>
+          </w:rPr>
+          <w:t xml:space="preserve">NAR coverage</w:t>
+        </w:r>
+      </w:hyperlink>
+    </w:p>
+    <w:p>
+      <w:pPr>
+        <w:pStyle w:val="ListParagraph"/>
+        <w:numPr>
+          <w:ilvl w:val="0"/>
+          <w:numId w:val="2"/>
+        </w:numPr>
+        <w:spacing w:after="100" w:line="288"/>
+      </w:pPr>
+      <w:r>
+        <w:rPr>
+          <w:sz w:val="22"/>
+          <w:szCs w:val="22"/>
+        </w:rPr>
         <w:t xml:space="preserve">Related: </w:t>
       </w:r>
-      <w:hyperlink w:history="1" r:id="rIdov5y8r_ox7p9eesjkxe2z">
+      <w:hyperlink w:history="1" r:id="rIdfuh8tfxq5zqa0gorhvk81">
         <w:r>
           <w:rPr>
             <w:rStyle w:val="Hyperlink"/>

</xml_diff>

<commit_message>
Reframe Viamericas intro to encompass the broader fintech-sports thesis
Retitle to "From Sponsor to Customer: Viamericas, Revolut, and Fintech's
New Sports Playbook" and rewrite the dek and opening so they set up both
the Viamericas news peg and the broader shift (Revolut, MLS remittance
rivals), with a clear throughline. Fixes the mismatch where a narrow
lede opened a now-broader article. No em dashes.

Co-Authored-By: Claude Opus 4.8 <noreply@anthropic.com>
Claude-Session: https://claude.ai/code/session_01WdmaS8fb3WHmxD5MVo6UfL
</commit_message>
<xml_diff>
--- a/blog/NYCFC-Viamericas-Remittance-Partner.docx
+++ b/blog/NYCFC-Viamericas-Remittance-Partner.docx
@@ -14,7 +14,7 @@
           <w:sz w:val="36"/>
           <w:szCs w:val="36"/>
         </w:rPr>
-        <w:t xml:space="preserve">New York City FC Names Viamericas Its Official Money Transfer and Remittance Partner</w:t>
+        <w:t xml:space="preserve">From Sponsor to Customer: Viamericas, Revolut, and Fintech's New Sports Playbook</w:t>
       </w:r>
     </w:p>
     <w:p>
@@ -28,7 +28,7 @@
           <w:sz w:val="22"/>
           <w:szCs w:val="22"/>
         </w:rPr>
-        <w:t xml:space="preserve">A remittance brand buys its way onto the kit, and closer to the fast-rising communities that send money home and buy homes here.</w:t>
+        <w:t xml:space="preserve">A remittance brand landing on NYCFC's kit is the latest sign of a broader shift: fintechs are turning sports sponsorships into customer-acquisition engines, and the sharpest are aiming straight at multicultural, cross-border communities.</w:t>
       </w:r>
     </w:p>
     <w:p>
@@ -65,7 +65,7 @@
           <w:sz w:val="22"/>
           <w:szCs w:val="22"/>
         </w:rPr>
-        <w:t xml:space="preserve">New York City FC has named </w:t>
+        <w:t xml:space="preserve">Fintechs have figured out that the fastest route to a customer's trust often runs through their team. Across 2026, banks, money-transfer firms, and challenger apps have poured into sports sponsorships, not as passive billboards but as acquisition channels aimed squarely at the audiences they most want to win. The latest and most on-point example: New York City FC has named </w:t>
       </w:r>
       <w:r>
         <w:rPr>
@@ -83,7 +83,7 @@
         </w:rPr>
         <w:t xml:space="preserve"> its Official International Money Transfer and Remittance Partner, the club </w:t>
       </w:r>
-      <w:hyperlink w:history="1" r:id="rId5ktosxiqsphy2ont3nh1v">
+      <w:hyperlink w:history="1" r:id="rIduhoyv7fad_royeokh64ga">
         <w:r>
           <w:rPr>
             <w:rStyle w:val="Hyperlink"/>
@@ -98,9 +98,9 @@
           <w:sz w:val="22"/>
           <w:szCs w:val="22"/>
         </w:rPr>
-        <w:t xml:space="preserve">. The deal gives Viamericas a prominent, first-of-its-kind spot: its brand becomes the </w:t>
-      </w:r>
-      <w:hyperlink w:history="1" r:id="rIdybdvbjxr7oba5tec2-oco">
+        <w:t xml:space="preserve">. Viamericas becomes the </w:t>
+      </w:r>
+      <w:hyperlink w:history="1" r:id="rId3cwf86lj3noeel5tq3-gl">
         <w:r>
           <w:rPr>
             <w:rStyle w:val="Hyperlink"/>
@@ -115,7 +115,19 @@
           <w:sz w:val="22"/>
           <w:szCs w:val="22"/>
         </w:rPr>
-        <w:t xml:space="preserve">, reinforced by in-stadium branding on matchdays. Both sides framed the tie-up around a shared connection to diverse, global communities, a natural fit for a remittance brand and a club whose fan base mirrors one of the world's most international cities.</w:t>
+        <w:t xml:space="preserve">, with in-stadium branding on matchdays, a natural fit for a remittance brand and a club whose fan base mirrors one of the world's most international cities.</w:t>
+      </w:r>
+    </w:p>
+    <w:p>
+      <w:pPr>
+        <w:spacing w:after="160" w:line="288"/>
+      </w:pPr>
+      <w:r>
+        <w:rPr>
+          <w:sz w:val="22"/>
+          <w:szCs w:val="22"/>
+        </w:rPr>
+        <w:t xml:space="preserve">One deal, but also a signal. From Revolut fusing Formula 1 and Serie A into a single fan moment to remittance rivals racing onto MLS pitches, sport is fast becoming the front door to a financial relationship. Here is what the Viamericas deal says, and how it fits the wider shift.</w:t>
       </w:r>
     </w:p>
     <w:p>
@@ -138,7 +150,7 @@
         </w:rPr>
         <w:t xml:space="preserve"> Viamericas is one of the largest licensed U.S. money transfer companies, serving families across </w:t>
       </w:r>
-      <w:hyperlink w:history="1" r:id="rIdktep-c4gmybj0rbvgzvqc">
+      <w:hyperlink w:history="1" r:id="rIdycyfx0mpf-ayuqj23x6m_">
         <w:r>
           <w:rPr>
             <w:rStyle w:val="Hyperlink"/>
@@ -176,7 +188,7 @@
         </w:rPr>
         <w:t xml:space="preserve"> The NYCFC sponsorship lands amid an aggressive growth push. In September 2025, Viamericas </w:t>
       </w:r>
-      <w:hyperlink w:history="1" r:id="rIdw-vb8y78tizotihyypbih">
+      <w:hyperlink w:history="1" r:id="rIddytnigw0ayhdnlvr-q-zz">
         <w:r>
           <w:rPr>
             <w:rStyle w:val="Hyperlink"/>
@@ -232,7 +244,7 @@
         </w:rPr>
         <w:t xml:space="preserve">The most eye-catching example came this fall from Revolut. The </w:t>
       </w:r>
-      <w:hyperlink w:history="1" r:id="rIdiullmnm2knzu_5ff2aao7">
+      <w:hyperlink w:history="1" r:id="rIdezl1bszjjww2oftwcvdld">
         <w:r>
           <w:rPr>
             <w:rStyle w:val="Hyperlink"/>
@@ -249,7 +261,7 @@
         </w:rPr>
         <w:t xml:space="preserve"> has been steadily assembling a sports portfolio, and it just </w:t>
       </w:r>
-      <w:hyperlink w:history="1" r:id="rIdyo1uiasm008b0gnuel8_-">
+      <w:hyperlink w:history="1" r:id="rId9auhgcqos3ekv-prljli8">
         <w:r>
           <w:rPr>
             <w:rStyle w:val="Hyperlink"/>
@@ -266,7 +278,7 @@
         </w:rPr>
         <w:t xml:space="preserve">, moving from the club's banking partner to the name across its chest. To activate the tie-up, Revolut parked the Audi Revolut F1 show car </w:t>
       </w:r>
-      <w:hyperlink w:history="1" r:id="rIdlepvlhltvzyb9c-vqlgde">
+      <w:hyperlink w:history="1" r:id="rIdv7chlj4bxtunwsyipk9ze">
         <w:r>
           <w:rPr>
             <w:rStyle w:val="Hyperlink"/>
@@ -295,7 +307,7 @@
         </w:rPr>
         <w:t xml:space="preserve">Underneath the spectacle runs a quieter, more targeted current, and it is the one Viamericas is riding: money-movement brands going precisely where their customers already are. In 2026, </w:t>
       </w:r>
-      <w:hyperlink w:history="1" r:id="rId6-dxuu8sw4o49dalcqxkk">
+      <w:hyperlink w:history="1" r:id="rId6usfk4lfggftrcyhfitqj">
         <w:r>
           <w:rPr>
             <w:rStyle w:val="Hyperlink"/>
@@ -312,7 +324,7 @@
         </w:rPr>
         <w:t xml:space="preserve">, and </w:t>
       </w:r>
-      <w:hyperlink w:history="1" r:id="rId8ixm3oj72nbtsq1zukdqb">
+      <w:hyperlink w:history="1" r:id="rIdnsld0xrjht18kuwaolz42">
         <w:r>
           <w:rPr>
             <w:rStyle w:val="Hyperlink"/>
@@ -384,7 +396,7 @@
         </w:rPr>
         <w:t xml:space="preserve">, Hispanics reached a </w:t>
       </w:r>
-      <w:hyperlink w:history="1" r:id="rIdcdygapswlvgy4md-lyhot">
+      <w:hyperlink w:history="1" r:id="rIdotzertbhwgi-voanijcm-">
         <w:r>
           <w:rPr>
             <w:rStyle w:val="Hyperlink"/>
@@ -401,7 +413,7 @@
         </w:rPr>
         <w:t xml:space="preserve">, a net gain of 441,000 in a year when most other groups declined (</w:t>
       </w:r>
-      <w:hyperlink w:history="1" r:id="rIdy6kv2f9wlwzcjtuiqovyq">
+      <w:hyperlink w:history="1" r:id="rIdorivyfrg-64mhihmxi6pc">
         <w:r>
           <w:rPr>
             <w:rStyle w:val="Hyperlink"/>
@@ -450,7 +462,7 @@
         </w:rPr>
         <w:t xml:space="preserve"> </w:t>
       </w:r>
-      <w:hyperlink w:history="1" r:id="rIdxklffdqsp4edvyq_6ni9o">
+      <w:hyperlink w:history="1" r:id="rIdaf7pxgfnfcco1xsr6jczv">
         <w:r>
           <w:rPr>
             <w:rStyle w:val="Hyperlink"/>
@@ -467,7 +479,7 @@
         </w:rPr>
         <w:t xml:space="preserve"> documenting a multi-year </w:t>
       </w:r>
-      <w:hyperlink w:history="1" r:id="rIduv6xoyp3cb6r-fkgfq--y">
+      <w:hyperlink w:history="1" r:id="rIdjwpboskey5rypcohxcv43">
         <w:r>
           <w:rPr>
             <w:rStyle w:val="Hyperlink"/>
@@ -517,7 +529,7 @@
         </w:rPr>
         <w:t xml:space="preserve"> </w:t>
       </w:r>
-      <w:hyperlink w:history="1" r:id="rIdpczmqcdv3lmqvujzjvotz">
+      <w:hyperlink w:history="1" r:id="rIdpawaegqujbtmcopoljvg-">
         <w:r>
           <w:rPr>
             <w:rStyle w:val="Hyperlink"/>
@@ -618,7 +630,7 @@
         </w:rPr>
         <w:t xml:space="preserve">New York City FC Announce Viamericas as Official International Money Transfer &amp; Remittance Partner (Aug 11, 2026): </w:t>
       </w:r>
-      <w:hyperlink w:history="1" r:id="rIdjwqqp7yeec5agusbfe7i_">
+      <w:hyperlink w:history="1" r:id="rIde8dpprhzgdy-kykn9hpb5">
         <w:r>
           <w:rPr>
             <w:rStyle w:val="Hyperlink"/>
@@ -635,7 +647,7 @@
         </w:rPr>
         <w:t xml:space="preserve"> · </w:t>
       </w:r>
-      <w:hyperlink w:history="1" r:id="rIdvj3pxkwf8bqcthqdzmspb">
+      <w:hyperlink w:history="1" r:id="rIdhmzdvd5_jklqmc3znvhlf">
         <w:r>
           <w:rPr>
             <w:rStyle w:val="Hyperlink"/>
@@ -652,7 +664,7 @@
         </w:rPr>
         <w:t xml:space="preserve"> · </w:t>
       </w:r>
-      <w:hyperlink w:history="1" r:id="rIdihh2hrwcyd4j-msn-ifof">
+      <w:hyperlink w:history="1" r:id="rIdzdo9e9uvqwdg42qntph7e">
         <w:r>
           <w:rPr>
             <w:rStyle w:val="Hyperlink"/>
@@ -679,7 +691,7 @@
         </w:rPr>
         <w:t xml:space="preserve">Viamericas Raises $113.6M to Expand Global Remittance Network Serving 95 Countries (Sep 2025): </w:t>
       </w:r>
-      <w:hyperlink w:history="1" r:id="rIdbnoj_fm22rb5px4xgtsvv">
+      <w:hyperlink w:history="1" r:id="rId8n6agnfvalnllwgzwvv7w">
         <w:r>
           <w:rPr>
             <w:rStyle w:val="Hyperlink"/>
@@ -696,7 +708,7 @@
         </w:rPr>
         <w:t xml:space="preserve"> · </w:t>
       </w:r>
-      <w:hyperlink w:history="1" r:id="rIdzyge79sfa1mm0kb6kffim">
+      <w:hyperlink w:history="1" r:id="rIdlxmfiwbajo13vv2nx7wh2">
         <w:r>
           <w:rPr>
             <w:rStyle w:val="Hyperlink"/>
@@ -723,7 +735,7 @@
         </w:rPr>
         <w:t xml:space="preserve">Revolut, Audi F1 title partnership and the Como 1907 show-car activation: </w:t>
       </w:r>
-      <w:hyperlink w:history="1" r:id="rIdnsvpqbi_jjnwzs8ng4oqy">
+      <w:hyperlink w:history="1" r:id="rIdx067wu621otijkviinm8p">
         <w:r>
           <w:rPr>
             <w:rStyle w:val="Hyperlink"/>
@@ -740,7 +752,7 @@
         </w:rPr>
         <w:t xml:space="preserve"> · </w:t>
       </w:r>
-      <w:hyperlink w:history="1" r:id="rId1cttt-36j3n4zfqlibudl">
+      <w:hyperlink w:history="1" r:id="rIdbhlhbdbjjw46jzsrton0g">
         <w:r>
           <w:rPr>
             <w:rStyle w:val="Hyperlink"/>
@@ -767,7 +779,7 @@
         </w:rPr>
         <w:t xml:space="preserve">Revolut becomes Como 1907's front-of-shirt sponsor for 2026/27 (upgraded from banking partner; fan pre-sales, co-branded products, product integration): </w:t>
       </w:r>
-      <w:hyperlink w:history="1" r:id="rIdo7lhsbru4jya6d1g_ontk">
+      <w:hyperlink w:history="1" r:id="rId3kftk37penpuphdtvdi4r">
         <w:r>
           <w:rPr>
             <w:rStyle w:val="Hyperlink"/>
@@ -784,7 +796,7 @@
         </w:rPr>
         <w:t xml:space="preserve"> · </w:t>
       </w:r>
-      <w:hyperlink w:history="1" r:id="rIdqemijvwn6ejwa1awf0oe0">
+      <w:hyperlink w:history="1" r:id="rId9eyiuvbnnvujoxeuyqmil">
         <w:r>
           <w:rPr>
             <w:rStyle w:val="Hyperlink"/>
@@ -811,7 +823,7 @@
         </w:rPr>
         <w:t xml:space="preserve">Ria Money Transfer, official remittance partner of Mexico's national teams (2026): </w:t>
       </w:r>
-      <w:hyperlink w:history="1" r:id="rIdcp8hji8vl2k3i8en03yk5">
+      <w:hyperlink w:history="1" r:id="rIdb2g7xl_9ogaosrcor7wby">
         <w:r>
           <w:rPr>
             <w:rStyle w:val="Hyperlink"/>
@@ -838,7 +850,7 @@
         </w:rPr>
         <w:t xml:space="preserve">Intermex, Official International Remittance Partner of the LA Galaxy (~70% Latino MLS viewership in California): </w:t>
       </w:r>
-      <w:hyperlink w:history="1" r:id="rIduimjpsvlyxifbepsalr9s">
+      <w:hyperlink w:history="1" r:id="rIdb9ynjqtb6och2dfbbq1y8">
         <w:r>
           <w:rPr>
             <w:rStyle w:val="Hyperlink"/>
@@ -865,7 +877,7 @@
         </w:rPr>
         <w:t xml:space="preserve">NAHREP, 2025 State of Hispanic Homeownership Report (record 10.2M Hispanic homeowners): </w:t>
       </w:r>
-      <w:hyperlink w:history="1" r:id="rIdjjd2wfaqu-9l4gx462_su">
+      <w:hyperlink w:history="1" r:id="rId7ao0ta2ggcde47l61dvek">
         <w:r>
           <w:rPr>
             <w:rStyle w:val="Hyperlink"/>
@@ -882,7 +894,7 @@
         </w:rPr>
         <w:t xml:space="preserve"> · </w:t>
       </w:r>
-      <w:hyperlink w:history="1" r:id="rIdbzohxgljmoqwxxhmfy88n">
+      <w:hyperlink w:history="1" r:id="rIdor8s87qvnzhytzqmxhw28">
         <w:r>
           <w:rPr>
             <w:rStyle w:val="Hyperlink"/>
@@ -909,7 +921,7 @@
         </w:rPr>
         <w:t xml:space="preserve">AREAA, State of Asia America Report (AAPI homeownership surge): </w:t>
       </w:r>
-      <w:hyperlink w:history="1" r:id="rId6syc4nq9scb0xq7uab3i2">
+      <w:hyperlink w:history="1" r:id="rId8g-hidf2x5dhrfatvlanx">
         <w:r>
           <w:rPr>
             <w:rStyle w:val="Hyperlink"/>
@@ -926,7 +938,7 @@
         </w:rPr>
         <w:t xml:space="preserve"> · </w:t>
       </w:r>
-      <w:hyperlink w:history="1" r:id="rIdel2nr5qdoaejn0qhv0amz">
+      <w:hyperlink w:history="1" r:id="rIdgukb8g2urzomatmfnihb8">
         <w:r>
           <w:rPr>
             <w:rStyle w:val="Hyperlink"/>
@@ -953,7 +965,7 @@
         </w:rPr>
         <w:t xml:space="preserve">Related: </w:t>
       </w:r>
-      <w:hyperlink w:history="1" r:id="rIdfuh8tfxq5zqa0gorhvk81">
+      <w:hyperlink w:history="1" r:id="rId5b6cchpcrbfrmqpgyi3yt">
         <w:r>
           <w:rPr>
             <w:rStyle w:val="Hyperlink"/>

</xml_diff>